<commit_message>
fix(docs): corregir 7 documentos Word contra código real
</commit_message>
<xml_diff>
--- a/Documentacion/word/01_Documentacion_Tecnica_Completa.docx
+++ b/Documentacion/word/01_Documentacion_Tecnica_Completa.docx
@@ -115,7 +115,7 @@
     </w:p>
     <w:p>
       <w:r>
-        <w:t>Trato Hecho es una aplicación web con agente conversacional inteligente que automatiza el proceso completo de cotización y cobro para Césped Sintético SpA. El sistema integra React.js para el frontend, n8n como orquestador de flujos, Claude Sonnet (Anthropic) para inteligencia artificial conversacional, PostgreSQL y Redis para persistencia, y MercadoPago para el procesamiento de pagos en línea.</w:t>
+        <w:t>Trato Hecho es una aplicación web con agente conversacional inteligente que automatiza el proceso completo de cotización y cobro para Césped Sintético SpA. El sistema integra HTML/JavaScript vanilla para el frontend, n8n como orquestador de flujos, Claude Sonnet (Anthropic) para inteligencia artificial conversacional, Supabase para persistencia, y MercadoPago para el procesamiento de pagos en línea.</w:t>
       </w:r>
     </w:p>
     <w:p>
@@ -141,7 +141,7 @@
     </w:p>
     <w:p>
       <w:r>
-        <w:t>La solución ofrece atención 24/7, generación automática de cotizaciones con número único (COT-YYYY-XXX), notificaciones instantáneas vía Telegram y correo electrónico, y botón de pago integrado en el chat mediante MercadoPago.</w:t>
+        <w:t>La solución ofrece atención 24/7, generación automática de cotizaciones con número único (COT-YYYY-XXXXXXXXX, basado en timestamp), notificaciones instantáneas vía Telegram y correo electrónico, y botón de pago integrado en el chat mediante MercadoPago.</w:t>
       </w:r>
     </w:p>
     <w:p>
@@ -183,7 +183,7 @@
         <w:pStyle w:val="ListBullet"/>
       </w:pPr>
       <w:r>
-        <w:t>Capa de Presentación (Frontend): React.js + Tailwind CSS. Interfaz de chat conversacional y calculadora interactiva de m². Desplegado en Vercel.</w:t>
+        <w:t>Capa de Presentación (Frontend): HTML/JavaScript vanilla + Tailwind CSS. Interfaz de chat conversacional y calculadora interactiva de m². Desplegado en Vercel.</w:t>
       </w:r>
     </w:p>
     <w:p>
@@ -207,7 +207,7 @@
         <w:pStyle w:val="ListBullet"/>
       </w:pPr>
       <w:r>
-        <w:t>Capa de Persistencia: PostgreSQL como fuente de verdad transaccional. Redis como caché de cotizaciones activas con TTL de 10 días.</w:t>
+        <w:t>Capa de Persistencia: Supabase como base de datos cloud (PostgreSQL gestionado). Tablas: cotizaciones e historial.</w:t>
       </w:r>
     </w:p>
     <w:p>
@@ -248,7 +248,7 @@
         <w:pStyle w:val="ListBullet"/>
       </w:pPr>
       <w:r>
-        <w:t>Paso 3: n8n consulta Redis por cotización activa (th:quote:{uuid}) y construye el prompt contextual.</w:t>
+        <w:t>Paso 3: n8n consulta Supabase tabla cotizaciones por session_id y construye el prompt contextual.</w:t>
       </w:r>
     </w:p>
     <w:p>
@@ -272,7 +272,7 @@
         <w:pStyle w:val="ListBullet"/>
       </w:pPr>
       <w:r>
-        <w:t>Paso 6a (COTIZAR): Genera número correlativo, persiste en PostgreSQL y Redis, notifica al negocio.</w:t>
+        <w:t>Paso 6a (COTIZAR): Genera número correlativo, persiste en Supabase, notifica al negocio.</w:t>
       </w:r>
     </w:p>
     <w:p>
@@ -363,7 +363,7 @@
           </w:tcPr>
           <w:p>
             <w:r>
-              <w:t>React 18 · Vite · Tailwind CSS · Vercel (deploy)</w:t>
+              <w:t>HTML/JavaScript vanilla · Tailwind CSS · Vercel (deploy)</w:t>
             </w:r>
           </w:p>
         </w:tc>
@@ -407,7 +407,7 @@
           </w:tcPr>
           <w:p>
             <w:r>
-              <w:t>Claude Sonnet 4.5 (Anthropic API) · Prompt engineering contextual</w:t>
+              <w:t>Claude Sonnet (claude-sonnet-4-6, Anthropic API) · Prompt engineering contextual</w:t>
             </w:r>
           </w:p>
         </w:tc>
@@ -429,7 +429,7 @@
           </w:tcPr>
           <w:p>
             <w:r>
-              <w:t>PostgreSQL (fuente de verdad) · Redis 7 (caché TTL 10 días)</w:t>
+              <w:t>Supabase (PostgreSQL gestionado cloud · tablas cotizaciones e historial)</w:t>
             </w:r>
           </w:p>
         </w:tc>
@@ -561,7 +561,7 @@
           </w:tcPr>
           <w:p>
             <w:r>
-              <w:t>UptimeRobot · Logs n8n en PostgreSQL</w:t>
+              <w:t>UptimeRobot · Logs n8n en Supabase</w:t>
             </w:r>
           </w:p>
         </w:tc>
@@ -594,7 +594,7 @@
         <w:rPr>
           <w:color w:val="0070C0"/>
         </w:rPr>
-        <w:t>4.1 Frontend (React.js)</w:t>
+        <w:t>4.1 Frontend (HTML/JavaScript vanilla)</w:t>
       </w:r>
     </w:p>
     <w:p>
@@ -680,7 +680,7 @@
         <w:pStyle w:val="ListBullet"/>
       </w:pPr>
       <w:r>
-        <w:t>Redis Get: Recupera cotización activa th:quote:{uuid} si TTL aún vigente.</w:t>
+        <w:t>Supabase GET: Recupera cotización activa de tabla cotizaciones si TTL aún vigente.</w:t>
       </w:r>
     </w:p>
     <w:p>
@@ -712,7 +712,7 @@
         <w:pStyle w:val="ListBullet"/>
       </w:pPr>
       <w:r>
-        <w:t>Redis INCR: Incrementa contador th:counter para número correlativo único.</w:t>
+        <w:t>Supabase/Timestamp: Genera número único campo numero con timestamp (COT-YYYY-XXXXXXXXX) para número correlativo único.</w:t>
       </w:r>
     </w:p>
     <w:p>
@@ -728,7 +728,7 @@
         <w:pStyle w:val="ListBullet"/>
       </w:pPr>
       <w:r>
-        <w:t>Redis Set: Cachea cotización con SETEX th:quote:{uuid} 864000 (10 días en segundos).</w:t>
+        <w:t>Supabase POST: Guarda cotización en tabla cotizaciones 864000 (10 días en segundos).</w:t>
       </w:r>
     </w:p>
     <w:p>
@@ -883,7 +883,7 @@
           </w:tcPr>
           <w:p>
             <w:r>
-              <w:t>Ej: COT-2026-001</w:t>
+              <w:t>Ej: COT-2026-XXXXX</w:t>
             </w:r>
           </w:p>
         </w:tc>
@@ -1163,7 +1163,7 @@
         <w:pStyle w:val="ListBullet"/>
       </w:pPr>
       <w:r>
-        <w:t>th:counter → Contador global para número correlativo de cotizaciones.</w:t>
+        <w:t>campo numero con timestamp (COT-YYYY-XXXXXXXXX) → Contador global para número correlativo de cotizaciones.</w:t>
       </w:r>
     </w:p>
     <w:p>
@@ -1171,7 +1171,7 @@
         <w:pStyle w:val="ListBullet"/>
       </w:pPr>
       <w:r>
-        <w:t>th:quote:{uuid} → JSON de cotización activa. TTL: 864000 segundos (10 días).</w:t>
+        <w:t>cotizaciones (tabla Supabase) → JSON de cotización activa. TTL: 864000 segundos (10 días).</w:t>
       </w:r>
     </w:p>
     <w:p>
@@ -1702,7 +1702,7 @@
         <w:pStyle w:val="ListBullet"/>
       </w:pPr>
       <w:r>
-        <w:t>VPS (Railway o Render): n8n + PostgreSQL + Redis en contenedores Docker.</w:t>
+        <w:t>VPS (Railway o Render): n8n + Supabase en contenedores Docker.</w:t>
       </w:r>
     </w:p>
     <w:p>
@@ -1710,7 +1710,7 @@
         <w:pStyle w:val="ListBullet"/>
       </w:pPr>
       <w:r>
-        <w:t>Vercel: Frontend React.js con CI/CD automático en cada push a main.</w:t>
+        <w:t>Vercel: Frontend HTML/JavaScript vanilla con CI/CD automático en cada push a main.</w:t>
       </w:r>
     </w:p>
     <w:p>
@@ -2097,7 +2097,7 @@
           </w:tcPr>
           <w:p>
             <w:r>
-              <w:t>COT-YYYY-XXX</w:t>
+              <w:t>COT-YYYY-XXXXXXX</w:t>
             </w:r>
           </w:p>
         </w:tc>
@@ -2107,7 +2107,7 @@
           </w:tcPr>
           <w:p>
             <w:r>
-              <w:t>Formato del número correlativo de cotización (ej: COT-2026-001).</w:t>
+              <w:t>Formato del número correlativo de cotización (ej: COT-2026-XXXXX).</w:t>
             </w:r>
           </w:p>
         </w:tc>

</xml_diff>